<commit_message>
Cap nhat bao cao GoStay
</commit_message>
<xml_diff>
--- a/GoStay_BTL_Goi_Nop_23_10_2026/01_Bao_cao/Bao_cao_GoStay.docx
+++ b/GoStay_BTL_Goi_Nop_23_10_2026/01_Bao_cao/Bao_cao_GoStay.docx
@@ -208,7 +208,7 @@
           </mc:Choice>
           <mc:Fallback>
             <w:pict>
-              <v:line w14:anchorId="6AD6371A" id="Straight Connector 1" o:spid="_x0000_s1026" style="position:absolute;z-index:251659264;visibility:visible;mso-wrap-style:square;mso-width-percent:0;mso-height-percent:0;mso-wrap-distance-left:9pt;mso-wrap-distance-top:-3e-5mm;mso-wrap-distance-right:9pt;mso-wrap-distance-bottom:-3e-5mm;mso-position-horizontal:absolute;mso-position-horizontal-relative:text;mso-position-vertical:absolute;mso-position-vertical-relative:text;mso-width-percent:0;mso-height-percent:0;mso-width-relative:page;mso-height-relative:page" from="147pt,1.75pt" to="323.3pt,1.75pt" o:gfxdata="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" strokecolor="windowText" strokeweight="1.5pt">
+              <v:line w14:anchorId="1063DEB5" id="Straight Connector 1" o:spid="_x0000_s1026" style="position:absolute;z-index:251659264;visibility:visible;mso-wrap-style:square;mso-width-percent:0;mso-height-percent:0;mso-wrap-distance-left:9pt;mso-wrap-distance-top:-3e-5mm;mso-wrap-distance-right:9pt;mso-wrap-distance-bottom:-3e-5mm;mso-position-horizontal:absolute;mso-position-horizontal-relative:text;mso-position-vertical:absolute;mso-position-vertical-relative:text;mso-width-percent:0;mso-height-percent:0;mso-width-relative:page;mso-height-relative:page" from="147pt,1.75pt" to="323.3pt,1.75pt" o:gfxdata="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" strokecolor="windowText" strokeweight="1.5pt">
                 <o:lock v:ext="edit" shapetype="f"/>
               </v:line>
             </w:pict>
@@ -668,60 +668,6 @@
           <w:lang w:val="pt-BR"/>
         </w:rPr>
         <w:t>(N01)</w:t>
-      </w:r>
-    </w:p>
-    <w:p>
-      <w:pPr>
-        <w:pBdr>
-          <w:top w:val="single" w:sz="4" w:space="1" w:color="auto"/>
-          <w:left w:val="single" w:sz="4" w:space="4" w:color="auto"/>
-          <w:bottom w:val="single" w:sz="4" w:space="31" w:color="auto"/>
-          <w:right w:val="single" w:sz="4" w:space="4" w:color="auto"/>
-        </w:pBdr>
-        <w:tabs>
-          <w:tab w:val="left" w:pos="567"/>
-          <w:tab w:val="left" w:pos="3119"/>
-        </w:tabs>
-        <w:ind w:firstLine="284"/>
-        <w:rPr>
-          <w:sz w:val="28"/>
-          <w:szCs w:val="28"/>
-          <w:lang w:val="pt-BR"/>
-        </w:rPr>
-      </w:pPr>
-      <w:r>
-        <w:rPr>
-          <w:b/>
-          <w:bCs/>
-          <w:sz w:val="28"/>
-          <w:szCs w:val="28"/>
-          <w:lang w:val="pt-BR"/>
-        </w:rPr>
-        <w:t>Chương trình đào tạo:</w:t>
-      </w:r>
-      <w:r>
-        <w:rPr>
-          <w:sz w:val="28"/>
-          <w:szCs w:val="28"/>
-          <w:lang w:val="pt-BR"/>
-        </w:rPr>
-        <w:t xml:space="preserve"> </w:t>
-      </w:r>
-      <w:r>
-        <w:rPr>
-          <w:sz w:val="28"/>
-          <w:szCs w:val="28"/>
-          <w:lang w:val="pt-BR"/>
-        </w:rPr>
-        <w:t>Công nghệ</w:t>
-      </w:r>
-      <w:r>
-        <w:rPr>
-          <w:sz w:val="28"/>
-          <w:szCs w:val="28"/>
-          <w:lang w:val="pt-BR"/>
-        </w:rPr>
-        <w:t xml:space="preserve"> thông tin</w:t>
       </w:r>
     </w:p>
     <w:p>
@@ -900,6 +846,24 @@
           </mc:Fallback>
         </mc:AlternateContent>
       </w:r>
+      <w:r>
+        <w:rPr>
+          <w:b/>
+          <w:bCs/>
+          <w:sz w:val="28"/>
+          <w:szCs w:val="28"/>
+          <w:lang w:val="pt-BR"/>
+        </w:rPr>
+        <w:t xml:space="preserve">Nhóm: </w:t>
+      </w:r>
+      <w:r>
+        <w:rPr>
+          <w:sz w:val="28"/>
+          <w:szCs w:val="28"/>
+          <w:lang w:val="pt-BR"/>
+        </w:rPr>
+        <w:t>14</w:t>
+      </w:r>
     </w:p>
     <w:p>
       <w:pPr>
@@ -924,7 +888,6 @@
           <w:b/>
           <w:sz w:val="32"/>
         </w:rPr>
-        <w:lastRenderedPageBreak/>
         <w:t>Mục lục</w:t>
       </w:r>
     </w:p>
@@ -2613,7 +2576,49 @@
         <w:rPr>
           <w:rFonts w:cs="Times New Roman"/>
         </w:rPr>
-        <w:t>Kết quả chính là bản v1 đã bổ sung guard, kiểm tra số học, optimistic version trên khóa phòng và worker thu hồi hết hạn. Thử nghiệm đối chứng tái hiện được dữ liệu sai ở v0; test hồi quy v1 từ chối cập nhật trên snapshot cũ và chỉ hoàn kho một lần. Các kết luận được giới hạn theo mô hình, dữ liệu và môi trường đã thực nghiệm.</w:t>
+        <w:t xml:space="preserve">Kết quả chính là bản v1 đã bổ sung </w:t>
+      </w:r>
+      <w:r>
+        <w:rPr>
+          <w:rFonts w:cs="Times New Roman"/>
+        </w:rPr>
+        <w:t>các điều kiện kiểm chứng</w:t>
+      </w:r>
+      <w:r>
+        <w:rPr>
+          <w:rFonts w:cs="Times New Roman"/>
+        </w:rPr>
+        <w:t>, kiểm tra số học, optimistic version trên khóa phòng và worker thu hồi hết hạn. Thử nghiệm đối chứng tái hiện được dữ liệu sai ở v0; test hồi quy v1 từ chối cập nhật trên snapshot cũ và chỉ hoàn kho một lần. Các kết luận được giới hạn theo mô hình, dữ liệu và môi trường đã thực nghiệm.</w:t>
+      </w:r>
+    </w:p>
+    <w:p>
+      <w:pPr>
+        <w:rPr>
+          <w:rFonts w:cs="Times New Roman"/>
+        </w:rPr>
+      </w:pPr>
+      <w:r>
+        <w:rPr>
+          <w:rFonts w:cs="Times New Roman"/>
+          <w:b/>
+          <w:bCs/>
+        </w:rPr>
+        <w:t>Link git</w:t>
+      </w:r>
+      <w:r>
+        <w:rPr>
+          <w:rFonts w:cs="Times New Roman"/>
+        </w:rPr>
+        <w:t>:</w:t>
+      </w:r>
+      <w:r>
+        <w:t xml:space="preserve"> </w:t>
+      </w:r>
+      <w:r>
+        <w:rPr>
+          <w:rFonts w:cs="Times New Roman"/>
+        </w:rPr>
+        <w:t>https://github.com/namnguyenit/GoTravel/tree/antpm/GoStay_BTL_Goi_Nop_23_10_2026</w:t>
       </w:r>
     </w:p>
     <w:p>
@@ -6078,7 +6083,21 @@
         <w:rPr>
           <w:rFonts w:cs="Times New Roman"/>
         </w:rPr>
-        <w:t>Mô hình hữu hạn có sáu trạng thái. Năm trạng thái mô tả vòng đời nghiệp vụ; S5 BAD được dùng khi một hành động trái quy trình đã xảy ra. Nhờ đó AG(!violation) kiểm tra một nhãn có ý nghĩa và không còn đúng tầm thường do thiếu trạng thái xấu.</w:t>
+        <w:t>Mô hình hữu hạn có sáu trạng thái. Năm trạng thái mô tả vòng đời nghiệp vụ; S5 BAD được dùng khi một hành động trái quy trình đã xảy ra. Nhờ đó AG</w:t>
+      </w:r>
+      <w:proofErr w:type="gramStart"/>
+      <w:r>
+        <w:rPr>
+          <w:rFonts w:cs="Times New Roman"/>
+        </w:rPr>
+        <w:t>(!violation</w:t>
+      </w:r>
+      <w:proofErr w:type="gramEnd"/>
+      <w:r>
+        <w:rPr>
+          <w:rFonts w:cs="Times New Roman"/>
+        </w:rPr>
+        <w:t>) kiểm tra một nhãn có ý nghĩa và không còn đúng tầm thường do thiếu trạng thái xấu.</w:t>
       </w:r>
     </w:p>
     <w:p>
@@ -6205,7 +6224,7 @@
           </mc:Choice>
           <mc:Fallback>
             <w:pict>
-              <v:rect w14:anchorId="5CAD10D6" id="Rectangle 4" o:spid="_x0000_s1026" alt="Ảnh được tạo 1" style="width:23.8pt;height:23.8pt;visibility:visible;mso-wrap-style:square;mso-left-percent:-10001;mso-top-percent:-10001;mso-position-horizontal:absolute;mso-position-horizontal-relative:char;mso-position-vertical:absolute;mso-position-vertical-relative:line;mso-left-percent:-10001;mso-top-percent:-10001;v-text-anchor:top" o:gfxdata="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" filled="f" stroked="f">
+              <v:rect w14:anchorId="0AFD138A" id="Rectangle 4" o:spid="_x0000_s1026" alt="Ảnh được tạo 1" style="width:23.8pt;height:23.8pt;visibility:visible;mso-wrap-style:square;mso-left-percent:-10001;mso-top-percent:-10001;mso-position-horizontal:absolute;mso-position-horizontal-relative:char;mso-position-vertical:absolute;mso-position-vertical-relative:line;mso-left-percent:-10001;mso-top-percent:-10001;v-text-anchor:top" o:gfxdata="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" filled="f" stroked="f">
                 <o:lock v:ext="edit" aspectratio="t"/>
                 <w10:anchorlock/>
               </v:rect>
@@ -6356,7 +6375,23 @@
                 <w:rFonts w:cs="Times New Roman"/>
                 <w:sz w:val="21"/>
               </w:rPr>
-              <w:t>AG(!violation)</w:t>
+              <w:t>AG</w:t>
+            </w:r>
+            <w:proofErr w:type="gramStart"/>
+            <w:r>
+              <w:rPr>
+                <w:rFonts w:cs="Times New Roman"/>
+                <w:sz w:val="21"/>
+              </w:rPr>
+              <w:t>(!violation</w:t>
+            </w:r>
+            <w:proofErr w:type="gramEnd"/>
+            <w:r>
+              <w:rPr>
+                <w:rFonts w:cs="Times New Roman"/>
+                <w:sz w:val="21"/>
+              </w:rPr>
+              <w:t>)</w:t>
             </w:r>
           </w:p>
         </w:tc>
@@ -6413,12 +6448,21 @@
                 <w:rFonts w:cs="Times New Roman"/>
               </w:rPr>
             </w:pPr>
-            <w:r>
-              <w:rPr>
-                <w:rFonts w:cs="Times New Roman"/>
-                <w:sz w:val="21"/>
-              </w:rPr>
-              <w:t>EF(booked)</w:t>
+            <w:proofErr w:type="gramStart"/>
+            <w:r>
+              <w:rPr>
+                <w:rFonts w:cs="Times New Roman"/>
+                <w:sz w:val="21"/>
+              </w:rPr>
+              <w:t>EF(</w:t>
+            </w:r>
+            <w:proofErr w:type="gramEnd"/>
+            <w:r>
+              <w:rPr>
+                <w:rFonts w:cs="Times New Roman"/>
+                <w:sz w:val="21"/>
+              </w:rPr>
+              <w:t>booked)</w:t>
             </w:r>
           </w:p>
         </w:tc>
@@ -6475,12 +6519,37 @@
                 <w:rFonts w:cs="Times New Roman"/>
               </w:rPr>
             </w:pPr>
-            <w:r>
-              <w:rPr>
-                <w:rFonts w:cs="Times New Roman"/>
-                <w:sz w:val="21"/>
-              </w:rPr>
-              <w:t>AG(holding -&gt; AF(booked | available))</w:t>
+            <w:proofErr w:type="gramStart"/>
+            <w:r>
+              <w:rPr>
+                <w:rFonts w:cs="Times New Roman"/>
+                <w:sz w:val="21"/>
+              </w:rPr>
+              <w:t>AG(</w:t>
+            </w:r>
+            <w:proofErr w:type="gramEnd"/>
+            <w:r>
+              <w:rPr>
+                <w:rFonts w:cs="Times New Roman"/>
+                <w:sz w:val="21"/>
+              </w:rPr>
+              <w:t xml:space="preserve">holding -&gt; </w:t>
+            </w:r>
+            <w:proofErr w:type="gramStart"/>
+            <w:r>
+              <w:rPr>
+                <w:rFonts w:cs="Times New Roman"/>
+                <w:sz w:val="21"/>
+              </w:rPr>
+              <w:t>AF(</w:t>
+            </w:r>
+            <w:proofErr w:type="gramEnd"/>
+            <w:r>
+              <w:rPr>
+                <w:rFonts w:cs="Times New Roman"/>
+                <w:sz w:val="21"/>
+              </w:rPr>
+              <w:t>booked | available))</w:t>
             </w:r>
           </w:p>
         </w:tc>
@@ -6537,12 +6606,37 @@
                 <w:rFonts w:cs="Times New Roman"/>
               </w:rPr>
             </w:pPr>
-            <w:r>
-              <w:rPr>
-                <w:rFonts w:cs="Times New Roman"/>
-                <w:sz w:val="21"/>
-              </w:rPr>
-              <w:t>AG(expired -&gt; AF(released))</w:t>
+            <w:proofErr w:type="gramStart"/>
+            <w:r>
+              <w:rPr>
+                <w:rFonts w:cs="Times New Roman"/>
+                <w:sz w:val="21"/>
+              </w:rPr>
+              <w:t>AG(</w:t>
+            </w:r>
+            <w:proofErr w:type="gramEnd"/>
+            <w:r>
+              <w:rPr>
+                <w:rFonts w:cs="Times New Roman"/>
+                <w:sz w:val="21"/>
+              </w:rPr>
+              <w:t xml:space="preserve">expired -&gt; </w:t>
+            </w:r>
+            <w:proofErr w:type="gramStart"/>
+            <w:r>
+              <w:rPr>
+                <w:rFonts w:cs="Times New Roman"/>
+                <w:sz w:val="21"/>
+              </w:rPr>
+              <w:t>AF(</w:t>
+            </w:r>
+            <w:proofErr w:type="gramEnd"/>
+            <w:r>
+              <w:rPr>
+                <w:rFonts w:cs="Times New Roman"/>
+                <w:sz w:val="21"/>
+              </w:rPr>
+              <w:t>released))</w:t>
             </w:r>
           </w:p>
         </w:tc>
@@ -6604,7 +6698,23 @@
                 <w:rFonts w:cs="Times New Roman"/>
                 <w:sz w:val="21"/>
               </w:rPr>
-              <w:t>AG(EX(true))</w:t>
+              <w:t>AG(</w:t>
+            </w:r>
+            <w:proofErr w:type="gramStart"/>
+            <w:r>
+              <w:rPr>
+                <w:rFonts w:cs="Times New Roman"/>
+                <w:sz w:val="21"/>
+              </w:rPr>
+              <w:t>EX(</w:t>
+            </w:r>
+            <w:proofErr w:type="gramEnd"/>
+            <w:r>
+              <w:rPr>
+                <w:rFonts w:cs="Times New Roman"/>
+                <w:sz w:val="21"/>
+              </w:rPr>
+              <w:t>true))</w:t>
             </w:r>
           </w:p>
         </w:tc>
@@ -6667,7 +6777,49 @@
         <w:rPr>
           <w:rFonts w:cs="Times New Roman"/>
         </w:rPr>
-        <w:t>AG(!violation) kiểm tra mọi trạng thái đạt được đều không mang nhãn vi phạm. EF(booked) chỉ chứng minh có một đường đến đặt thành công. AG(EX(true)) kiểm tra quan hệ chuyển tiếp toàn phần, không chứng minh database không deadlock. Hai thuộc tính AF kiểm tra mọi đường trong graph cuối cùng rời trạng thái giữ hoặc hết hạn.</w:t>
+        <w:t>AG</w:t>
+      </w:r>
+      <w:proofErr w:type="gramStart"/>
+      <w:r>
+        <w:rPr>
+          <w:rFonts w:cs="Times New Roman"/>
+        </w:rPr>
+        <w:t>(!violation</w:t>
+      </w:r>
+      <w:proofErr w:type="gramEnd"/>
+      <w:r>
+        <w:rPr>
+          <w:rFonts w:cs="Times New Roman"/>
+        </w:rPr>
+        <w:t xml:space="preserve">) kiểm tra mọi trạng thái đạt được đều không mang nhãn vi phạm. </w:t>
+      </w:r>
+      <w:proofErr w:type="gramStart"/>
+      <w:r>
+        <w:rPr>
+          <w:rFonts w:cs="Times New Roman"/>
+        </w:rPr>
+        <w:t>EF(</w:t>
+      </w:r>
+      <w:proofErr w:type="gramEnd"/>
+      <w:r>
+        <w:rPr>
+          <w:rFonts w:cs="Times New Roman"/>
+        </w:rPr>
+        <w:t>booked) chỉ chứng minh có một đường đến đặt thành công. AG(</w:t>
+      </w:r>
+      <w:proofErr w:type="gramStart"/>
+      <w:r>
+        <w:rPr>
+          <w:rFonts w:cs="Times New Roman"/>
+        </w:rPr>
+        <w:t>EX(</w:t>
+      </w:r>
+      <w:proofErr w:type="gramEnd"/>
+      <w:r>
+        <w:rPr>
+          <w:rFonts w:cs="Times New Roman"/>
+        </w:rPr>
+        <w:t>true)) kiểm tra quan hệ chuyển tiếp toàn phần, không chứng minh database không deadlock. Hai thuộc tính AF kiểm tra mọi đường trong graph cuối cùng rời trạng thái giữ hoặc hết hạn.</w:t>
       </w:r>
     </w:p>
     <w:p>
@@ -7231,7 +7383,23 @@
           <w:rFonts w:cs="Times New Roman"/>
           <w:sz w:val="18"/>
         </w:rPr>
-        <w:t>@Column(name = "version")</w:t>
+        <w:t>@</w:t>
+      </w:r>
+      <w:proofErr w:type="gramStart"/>
+      <w:r>
+        <w:rPr>
+          <w:rFonts w:cs="Times New Roman"/>
+          <w:sz w:val="18"/>
+        </w:rPr>
+        <w:t>Column(</w:t>
+      </w:r>
+      <w:proofErr w:type="gramEnd"/>
+      <w:r>
+        <w:rPr>
+          <w:rFonts w:cs="Times New Roman"/>
+          <w:sz w:val="18"/>
+        </w:rPr>
+        <w:t>name = "version")</w:t>
       </w:r>
     </w:p>
     <w:p>
@@ -7353,7 +7521,39 @@
           <w:rFonts w:cs="Times New Roman"/>
           <w:sz w:val="18"/>
         </w:rPr>
-        <w:t>if (lock == null || lock.getLockStatus() != LOCKED</w:t>
+        <w:t xml:space="preserve">if (lock == null || </w:t>
+      </w:r>
+      <w:proofErr w:type="gramStart"/>
+      <w:r>
+        <w:rPr>
+          <w:rFonts w:cs="Times New Roman"/>
+          <w:sz w:val="18"/>
+        </w:rPr>
+        <w:t>lock.getLockStatus</w:t>
+      </w:r>
+      <w:proofErr w:type="gramEnd"/>
+      <w:r>
+        <w:rPr>
+          <w:rFonts w:cs="Times New Roman"/>
+          <w:sz w:val="18"/>
+        </w:rPr>
+        <w:t>(</w:t>
+      </w:r>
+      <w:proofErr w:type="gramStart"/>
+      <w:r>
+        <w:rPr>
+          <w:rFonts w:cs="Times New Roman"/>
+          <w:sz w:val="18"/>
+        </w:rPr>
+        <w:t>) !</w:t>
+      </w:r>
+      <w:proofErr w:type="gramEnd"/>
+      <w:r>
+        <w:rPr>
+          <w:rFonts w:cs="Times New Roman"/>
+          <w:sz w:val="18"/>
+        </w:rPr>
+        <w:t>= LOCKED</w:t>
       </w:r>
     </w:p>
     <w:p>
@@ -7368,7 +7568,23 @@
           <w:rFonts w:cs="Times New Roman"/>
           <w:sz w:val="18"/>
         </w:rPr>
-        <w:t xml:space="preserve">        || lock.getExpiresAt() == null</w:t>
+        <w:t xml:space="preserve">        || </w:t>
+      </w:r>
+      <w:proofErr w:type="gramStart"/>
+      <w:r>
+        <w:rPr>
+          <w:rFonts w:cs="Times New Roman"/>
+          <w:sz w:val="18"/>
+        </w:rPr>
+        <w:t>lock.getExpiresAt</w:t>
+      </w:r>
+      <w:proofErr w:type="gramEnd"/>
+      <w:r>
+        <w:rPr>
+          <w:rFonts w:cs="Times New Roman"/>
+          <w:sz w:val="18"/>
+        </w:rPr>
+        <w:t>() == null</w:t>
       </w:r>
     </w:p>
     <w:p>
@@ -7383,7 +7599,39 @@
           <w:rFonts w:cs="Times New Roman"/>
           <w:sz w:val="18"/>
         </w:rPr>
-        <w:t xml:space="preserve">        || lock.getExpiresAt().isAfter(now)) {</w:t>
+        <w:t xml:space="preserve">        || </w:t>
+      </w:r>
+      <w:proofErr w:type="gramStart"/>
+      <w:r>
+        <w:rPr>
+          <w:rFonts w:cs="Times New Roman"/>
+          <w:sz w:val="18"/>
+        </w:rPr>
+        <w:t>lock.getExpiresAt</w:t>
+      </w:r>
+      <w:proofErr w:type="gramEnd"/>
+      <w:r>
+        <w:rPr>
+          <w:rFonts w:cs="Times New Roman"/>
+          <w:sz w:val="18"/>
+        </w:rPr>
+        <w:t>(</w:t>
+      </w:r>
+      <w:proofErr w:type="gramStart"/>
+      <w:r>
+        <w:rPr>
+          <w:rFonts w:cs="Times New Roman"/>
+          <w:sz w:val="18"/>
+        </w:rPr>
+        <w:t>).isAfter</w:t>
+      </w:r>
+      <w:proofErr w:type="gramEnd"/>
+      <w:r>
+        <w:rPr>
+          <w:rFonts w:cs="Times New Roman"/>
+          <w:sz w:val="18"/>
+        </w:rPr>
+        <w:t>(now)) {</w:t>
       </w:r>
     </w:p>
     <w:p>
@@ -7438,12 +7686,21 @@
           <w:rFonts w:cs="Times New Roman"/>
         </w:rPr>
       </w:pPr>
+      <w:proofErr w:type="gramStart"/>
       <w:r>
         <w:rPr>
           <w:rFonts w:cs="Times New Roman"/>
           <w:sz w:val="18"/>
         </w:rPr>
-        <w:t>lock.setLockStatus(RELEASED);</w:t>
+        <w:t>lock.setLockStatus</w:t>
+      </w:r>
+      <w:proofErr w:type="gramEnd"/>
+      <w:r>
+        <w:rPr>
+          <w:rFonts w:cs="Times New Roman"/>
+          <w:sz w:val="18"/>
+        </w:rPr>
+        <w:t>(RELEASED);</w:t>
       </w:r>
     </w:p>
     <w:p>
@@ -7453,12 +7710,21 @@
           <w:rFonts w:cs="Times New Roman"/>
         </w:rPr>
       </w:pPr>
+      <w:proofErr w:type="gramStart"/>
       <w:r>
         <w:rPr>
           <w:rFonts w:cs="Times New Roman"/>
           <w:sz w:val="18"/>
         </w:rPr>
-        <w:t>calendar.setAvailableQuantity(restored);</w:t>
+        <w:t>calendar.setAvailableQuantity</w:t>
+      </w:r>
+      <w:proofErr w:type="gramEnd"/>
+      <w:r>
+        <w:rPr>
+          <w:rFonts w:cs="Times New Roman"/>
+          <w:sz w:val="18"/>
+        </w:rPr>
+        <w:t>(restored);</w:t>
       </w:r>
     </w:p>
     <w:p>
@@ -8547,7 +8813,23 @@
           <w:rFonts w:cs="Times New Roman"/>
           <w:sz w:val="18"/>
         </w:rPr>
-        <w:t>BMC(k) = I(s0) AND T(s0,s1) AND ...</w:t>
+        <w:t>BMC(k) = I(s0) AND T(s</w:t>
+      </w:r>
+      <w:proofErr w:type="gramStart"/>
+      <w:r>
+        <w:rPr>
+          <w:rFonts w:cs="Times New Roman"/>
+          <w:sz w:val="18"/>
+        </w:rPr>
+        <w:t>0,s</w:t>
+      </w:r>
+      <w:proofErr w:type="gramEnd"/>
+      <w:r>
+        <w:rPr>
+          <w:rFonts w:cs="Times New Roman"/>
+          <w:sz w:val="18"/>
+        </w:rPr>
+        <w:t>1) AND ...</w:t>
       </w:r>
     </w:p>
     <w:p>
@@ -8562,7 +8844,23 @@
           <w:rFonts w:cs="Times New Roman"/>
           <w:sz w:val="18"/>
         </w:rPr>
-        <w:t xml:space="preserve">         AND T(s[k-1],s[k])</w:t>
+        <w:t xml:space="preserve">         AND T(s[k-1</w:t>
+      </w:r>
+      <w:proofErr w:type="gramStart"/>
+      <w:r>
+        <w:rPr>
+          <w:rFonts w:cs="Times New Roman"/>
+          <w:sz w:val="18"/>
+        </w:rPr>
+        <w:t>],s</w:t>
+      </w:r>
+      <w:proofErr w:type="gramEnd"/>
+      <w:r>
+        <w:rPr>
+          <w:rFonts w:cs="Times New Roman"/>
+          <w:sz w:val="18"/>
+        </w:rPr>
+        <w:t>[k])</w:t>
       </w:r>
     </w:p>
     <w:p>
@@ -9818,7 +10116,23 @@
           <w:rFonts w:cs="Times New Roman"/>
           <w:sz w:val="18"/>
         </w:rPr>
-        <w:t>*lock_ptr = NULL;</w:t>
+        <w:t>*</w:t>
+      </w:r>
+      <w:proofErr w:type="gramStart"/>
+      <w:r>
+        <w:rPr>
+          <w:rFonts w:cs="Times New Roman"/>
+          <w:sz w:val="18"/>
+        </w:rPr>
+        <w:t>lock</w:t>
+      </w:r>
+      <w:proofErr w:type="gramEnd"/>
+      <w:r>
+        <w:rPr>
+          <w:rFonts w:cs="Times New Roman"/>
+          <w:sz w:val="18"/>
+        </w:rPr>
+        <w:t>_ptr = NULL;</w:t>
       </w:r>
     </w:p>
     <w:p>
@@ -10268,7 +10582,21 @@
         <w:rPr>
           <w:rFonts w:cs="Times New Roman"/>
         </w:rPr>
-        <w:t>Khả năng từ chối toàn bộ input sai trong tập này không đồng nghĩa đạt 100% an toàn. Test không gửi request HTTP, không kiểm tra gateway, JWT, serialization hay database thật. Corpus có hướng dẫn biên cố định, chưa phải coverage-guided hoặc concolic fuzzing.</w:t>
+        <w:t xml:space="preserve">Khả năng từ chối toàn bộ input sai trong tập này không đồng nghĩa đạt 100% </w:t>
+      </w:r>
+      <w:proofErr w:type="gramStart"/>
+      <w:r>
+        <w:rPr>
+          <w:rFonts w:cs="Times New Roman"/>
+        </w:rPr>
+        <w:t>an</w:t>
+      </w:r>
+      <w:proofErr w:type="gramEnd"/>
+      <w:r>
+        <w:rPr>
+          <w:rFonts w:cs="Times New Roman"/>
+        </w:rPr>
+        <w:t xml:space="preserve"> toàn. Test không gửi request HTTP, không kiểm tra gateway, JWT, serialization hay database thật. Corpus có hướng dẫn biên cố định, chưa phải coverage-guided hoặc concolic fuzzing.</w:t>
       </w:r>
     </w:p>
     <w:p>
@@ -12680,7 +13008,21 @@
         <w:rPr>
           <w:rFonts w:cs="Times New Roman"/>
         </w:rPr>
-        <w:t>Đầu mối kiểm tra là verification_results.json. Các log đầy đủ gồm junit_v0.log, junit_v1.log, python_tests.log, ast_compile.log, ast_v0.log, ast_v1.log, cppcheck_v0.log, cppcheck_v1.log và c_execute_v1.log. Mỗi kết quả có thể đối chiếu về source hoặc input đi kèm.</w:t>
+        <w:t>Đầu mối kiểm tra là verification_</w:t>
+      </w:r>
+      <w:proofErr w:type="gramStart"/>
+      <w:r>
+        <w:rPr>
+          <w:rFonts w:cs="Times New Roman"/>
+        </w:rPr>
+        <w:t>results.json</w:t>
+      </w:r>
+      <w:proofErr w:type="gramEnd"/>
+      <w:r>
+        <w:rPr>
+          <w:rFonts w:cs="Times New Roman"/>
+        </w:rPr>
+        <w:t>. Các log đầy đủ gồm junit_v0.log, junit_v1.log, python_tests.log, ast_compile.log, ast_v0.log, ast_v1.log, cppcheck_v0.log, cppcheck_v1.log và c_execute_v1.log. Mỗi kết quả có thể đối chiếu về source hoặc input đi kèm.</w:t>
       </w:r>
     </w:p>
     <w:p>

</xml_diff>